<commit_message>
Feat: asistente por chat basado en reglas (POST /api/chat) que recomienda locales destacados y panel flotante en el frontend; docs a v2.2 y v1.5 (39 API + 13 e2e = 52 casos)
</commit_message>
<xml_diff>
--- a/Documentacion_Tecnica_Requintu.docx
+++ b/Documentacion_Tecnica_Requintu.docx
@@ -25,7 +25,7 @@
         <w:jc w:val="center"/>
       </w:pPr>
       <w:r>
-        <w:t xml:space="preserve">Versión 2.1 — 18 de septiembre de 2026</w:t>
+        <w:t xml:space="preserve">Versión 2.2 — 18 de septiembre de 2026</w:t>
       </w:r>
     </w:p>
     <w:p>
@@ -55,6 +55,18 @@
           <w:szCs w:val="22"/>
         </w:rPr>
         <w:t xml:space="preserve">Requintu es una aplicación que conecta a viajeros y usuarios con los negocios locales de Colombia. Los usuarios pueden explorar locales a través de un mapa interactivo dividido por departamentos y municipios, consultar el detalle de cada negocio (fotos, promociones, calificaciones, ubicación), publicar contenido en un muro comunitario con avisos en tiempo real y, en el caso de los comerciantes, crear y administrar sus propios locales. Una cuenta de administrador permite gestionar usuarios, locales y publicaciones en un panel dedicado.</w:t>
+      </w:r>
+    </w:p>
+    <w:p>
+      <w:pPr>
+        <w:spacing w:after="120"/>
+      </w:pPr>
+      <w:r>
+        <w:rPr>
+          <w:sz w:val="22"/>
+          <w:szCs w:val="22"/>
+        </w:rPr>
+        <w:t xml:space="preserve">Un asistente por chat (basado en reglas, sin servicios de IA externos) recomienda locales a los visitantes: entiende saludos, agradecimientos y peticiones que mencionan un municipio, un departamento o una categoría, y responde con las mejores opciones (los locales destacados primero) en español o inglés, con tarjetas enlazadas al detalle de cada negocio.</w:t>
       </w:r>
     </w:p>
     <w:p>
@@ -772,7 +784,7 @@
                 <w:sz w:val="20"/>
                 <w:szCs w:val="20"/>
               </w:rPr>
-              <w:t xml:space="preserve">Suite de pruebas de integración (npm test, 34 pruebas).</w:t>
+              <w:t xml:space="preserve">Suite de pruebas de integración (npm test, 39 pruebas).</w:t>
             </w:r>
           </w:p>
         </w:tc>
@@ -1271,7 +1283,7 @@
           <w:sz w:val="18"/>
           <w:szCs w:val="18"/>
         </w:rPr>
-        <w:t xml:space="preserve">  test/api.test.mjs        # 34 pruebas de integración (node:test)</w:t>
+        <w:t xml:space="preserve">  test/api.test.mjs        # 39 pruebas de integración (node:test)</w:t>
       </w:r>
     </w:p>
     <w:p>
@@ -1286,7 +1298,7 @@
           <w:sz w:val="18"/>
           <w:szCs w:val="18"/>
         </w:rPr>
-        <w:t xml:space="preserve">  Documentacion_Tecnica_Requintu.pdf|docx  (v2.1)</w:t>
+        <w:t xml:space="preserve">  Documentacion_Tecnica_Requintu.pdf|docx  (v2.2)</w:t>
       </w:r>
     </w:p>
     <w:p>
@@ -1301,7 +1313,7 @@
           <w:sz w:val="18"/>
           <w:szCs w:val="18"/>
         </w:rPr>
-        <w:t xml:space="preserve">  Informe_de_Pruebas_Requintu.pdf|docx      (v1.4)</w:t>
+        <w:t xml:space="preserve">  Informe_de_Pruebas_Requintu.pdf|docx      (v1.5)</w:t>
       </w:r>
     </w:p>
     <w:p>
@@ -1527,6 +1539,21 @@
           <w:szCs w:val="18"/>
         </w:rPr>
         <w:t xml:space="preserve">                           # LocalDetalle, CrearLocal, Publicaciones, Perfil, Admin</w:t>
+      </w:r>
+    </w:p>
+    <w:p>
+      <w:pPr>
+        <w:shd w:fill="F2F2F2" w:color="auto"/>
+        <w:spacing w:after="40"/>
+      </w:pPr>
+      <w:r>
+        <w:rPr>
+          <w:rFonts w:ascii="Consolas" w:cs="Consolas" w:eastAsia="Consolas" w:hAnsi="Consolas"/>
+          <w:color w:val="1f3864"/>
+          <w:sz w:val="18"/>
+          <w:szCs w:val="18"/>
+        </w:rPr>
+        <w:t xml:space="preserve">      components/          # ChatBot (asistente flotante), Navbar, Footer, InstallBanner</w:t>
       </w:r>
     </w:p>
     <w:p>
@@ -4562,6 +4589,169 @@
     </w:tbl>
     <w:p>
       <w:pPr>
+        <w:pStyle w:val="Heading2"/>
+        <w:spacing w:after="100" w:before="200"/>
+      </w:pPr>
+      <w:r>
+        <w:t xml:space="preserve">6.6 Asistente por chat</w:t>
+      </w:r>
+    </w:p>
+    <w:tbl>
+      <w:tblPr>
+        <w:tblW w:type="pct" w:w="100%"/>
+        <w:tblBorders>
+          <w:top w:val="single" w:color="12283D" w:sz="4"/>
+          <w:left w:val="single" w:color="12283D" w:sz="4"/>
+          <w:bottom w:val="single" w:color="12283D" w:sz="4"/>
+          <w:right w:val="single" w:color="12283D" w:sz="4"/>
+          <w:insideH w:val="single" w:color="BBBBBB" w:sz="2"/>
+          <w:insideV w:val="single" w:color="BBBBBB" w:sz="2"/>
+        </w:tblBorders>
+      </w:tblPr>
+      <w:tblGrid>
+        <w:gridCol w:w="100"/>
+        <w:gridCol w:w="100"/>
+        <w:gridCol w:w="100"/>
+        <w:gridCol w:w="100"/>
+      </w:tblGrid>
+      <w:tr>
+        <w:trPr>
+          <w:tblHeader/>
+        </w:trPr>
+        <w:tc>
+          <w:tcPr>
+            <w:shd w:fill="12283D" w:color="auto"/>
+            <w:vAlign w:val="center"/>
+          </w:tcPr>
+          <w:p>
+            <w:r>
+              <w:rPr>
+                <w:b/>
+                <w:bCs/>
+                <w:color w:val="FFFFFF"/>
+                <w:sz w:val="20"/>
+                <w:szCs w:val="20"/>
+              </w:rPr>
+              <w:t xml:space="preserve">Método</w:t>
+            </w:r>
+          </w:p>
+        </w:tc>
+        <w:tc>
+          <w:tcPr>
+            <w:shd w:fill="12283D" w:color="auto"/>
+            <w:vAlign w:val="center"/>
+          </w:tcPr>
+          <w:p>
+            <w:r>
+              <w:rPr>
+                <w:b/>
+                <w:bCs/>
+                <w:color w:val="FFFFFF"/>
+                <w:sz w:val="20"/>
+                <w:szCs w:val="20"/>
+              </w:rPr>
+              <w:t xml:space="preserve">Ruta</w:t>
+            </w:r>
+          </w:p>
+        </w:tc>
+        <w:tc>
+          <w:tcPr>
+            <w:shd w:fill="12283D" w:color="auto"/>
+            <w:vAlign w:val="center"/>
+          </w:tcPr>
+          <w:p>
+            <w:r>
+              <w:rPr>
+                <w:b/>
+                <w:bCs/>
+                <w:color w:val="FFFFFF"/>
+                <w:sz w:val="20"/>
+                <w:szCs w:val="20"/>
+              </w:rPr>
+              <w:t xml:space="preserve">Acceso</w:t>
+            </w:r>
+          </w:p>
+        </w:tc>
+        <w:tc>
+          <w:tcPr>
+            <w:shd w:fill="12283D" w:color="auto"/>
+            <w:vAlign w:val="center"/>
+          </w:tcPr>
+          <w:p>
+            <w:r>
+              <w:rPr>
+                <w:b/>
+                <w:bCs/>
+                <w:color w:val="FFFFFF"/>
+                <w:sz w:val="20"/>
+                <w:szCs w:val="20"/>
+              </w:rPr>
+              <w:t xml:space="preserve">Descripción</w:t>
+            </w:r>
+          </w:p>
+        </w:tc>
+      </w:tr>
+      <w:tr>
+        <w:tc>
+          <w:tcPr>
+            <w:vAlign w:val="center"/>
+          </w:tcPr>
+          <w:p>
+            <w:r>
+              <w:rPr>
+                <w:sz w:val="20"/>
+                <w:szCs w:val="20"/>
+              </w:rPr>
+              <w:t xml:space="preserve">POST</w:t>
+            </w:r>
+          </w:p>
+        </w:tc>
+        <w:tc>
+          <w:tcPr>
+            <w:vAlign w:val="center"/>
+          </w:tcPr>
+          <w:p>
+            <w:r>
+              <w:rPr>
+                <w:sz w:val="20"/>
+                <w:szCs w:val="20"/>
+              </w:rPr>
+              <w:t xml:space="preserve">/api/chat</w:t>
+            </w:r>
+          </w:p>
+        </w:tc>
+        <w:tc>
+          <w:tcPr>
+            <w:vAlign w:val="center"/>
+          </w:tcPr>
+          <w:p>
+            <w:r>
+              <w:rPr>
+                <w:sz w:val="20"/>
+                <w:szCs w:val="20"/>
+              </w:rPr>
+              <w:t xml:space="preserve">Público</w:t>
+            </w:r>
+          </w:p>
+        </w:tc>
+        <w:tc>
+          <w:tcPr>
+            <w:vAlign w:val="center"/>
+          </w:tcPr>
+          <w:p>
+            <w:r>
+              <w:rPr>
+                <w:sz w:val="20"/>
+                <w:szCs w:val="20"/>
+              </w:rPr>
+              <w:t xml:space="preserve">Asistente basado en reglas: detecta saludo, agradecimiento y peticiones de recomendación mencionando un municipio, departamento o categoría; devuelve los mejores locales (destacados primero) con estrellas y sugerencias de seguimiento, en español o inglés (body: mensaje y lang opcional).</w:t>
+            </w:r>
+          </w:p>
+        </w:tc>
+      </w:tr>
+    </w:tbl>
+    <w:p>
+      <w:pPr>
         <w:pStyle w:val="Heading1"/>
         <w:spacing w:after="120" w:before="240"/>
       </w:pPr>
@@ -5524,6 +5714,36 @@
                 <w:sz w:val="20"/>
                 <w:szCs w:val="20"/>
               </w:rPr>
+              <w:t xml:space="preserve">Asistente (chat flotante)</w:t>
+            </w:r>
+          </w:p>
+        </w:tc>
+        <w:tc>
+          <w:tcPr>
+            <w:vAlign w:val="center"/>
+          </w:tcPr>
+          <w:p>
+            <w:r>
+              <w:rPr>
+                <w:sz w:val="20"/>
+                <w:szCs w:val="20"/>
+              </w:rPr>
+              <w:t xml:space="preserve">Botón flotante global (ChatBot.jsx) que usa /api/chat: recomienda locales destacados con tarjetas, insignia «Oficial», estrellas y atajos de mensajes sugeridos.</w:t>
+            </w:r>
+          </w:p>
+        </w:tc>
+      </w:tr>
+      <w:tr>
+        <w:tc>
+          <w:tcPr>
+            <w:vAlign w:val="center"/>
+          </w:tcPr>
+          <w:p>
+            <w:r>
+              <w:rPr>
+                <w:sz w:val="20"/>
+                <w:szCs w:val="20"/>
+              </w:rPr>
               <w:t xml:space="preserve">Perfil</w:t>
             </w:r>
           </w:p>
@@ -5823,7 +6043,7 @@
           <w:sz w:val="18"/>
           <w:szCs w:val="18"/>
         </w:rPr>
-        <w:t xml:space="preserve">Backend:  npm install ; cp .env.example .env ; npm run dev | npm test (34 pruebas)</w:t>
+        <w:t xml:space="preserve">Backend:  npm install ; cp .env.example .env ; npm run dev | npm test (39 pruebas)</w:t>
       </w:r>
     </w:p>
     <w:p>
@@ -6100,7 +6320,7 @@
           <w:sz w:val="22"/>
           <w:szCs w:val="22"/>
         </w:rPr>
-        <w:t xml:space="preserve">Backend (node:test): npm test ejecuta test/api.test.mjs con 34 pruebas de integración contra la base de datos real: autenticación, roles (turista, comerciante, comerciante_premium con límite de 5 locales, alcaldia con local destacado), CORS, CRUD de publicaciones, filtros de locales, validación de imágenes (magic bytes), cuotas de subida (F02), allowlist de imagen_url (F03), SSE autenticado (F01), recuperación de contraseña y rotación/revocación de sesiones.</w:t>
+        <w:t xml:space="preserve">Backend (node:test): npm test ejecuta test/api.test.mjs con 39 pruebas de integración contra la base de datos real: autenticación, roles (turista, comerciante, comerciante_premium con límite de 5 locales, alcaldia con local destacado), CORS, CRUD de publicaciones, filtros de locales, validación de imágenes (magic bytes), cuotas de subida (F02), allowlist de imagen_url (F03), SSE autenticado (F01), recuperación de contraseña, rotación/revocación de sesiones y el asistente por chat (saludo, mensaje vacío, respuesta en inglés, recomendación por municipio con los destacados primero y filtro por categoría).</w:t>
       </w:r>
     </w:p>
     <w:p>
@@ -6124,7 +6344,7 @@
           <w:sz w:val="22"/>
           <w:szCs w:val="22"/>
         </w:rPr>
-        <w:t xml:space="preserve">El detalle caso a caso está en el Informe de Pruebas (v1.4).</w:t>
+        <w:t xml:space="preserve">El detalle caso a caso está en el Informe de Pruebas (v1.5).</w:t>
       </w:r>
     </w:p>
     <w:p>
@@ -6372,7 +6592,7 @@
         <w:sz w:val="16"/>
         <w:szCs w:val="16"/>
       </w:rPr>
-      <w:t xml:space="preserve">Documentación Técnica Requintu v2.1  |  Página </w:t>
+      <w:t xml:space="preserve">Documentación Técnica Requintu v2.2  |  Página </w:t>
     </w:r>
     <w:r>
       <w:rPr>

</xml_diff>